<commit_message>
Update outer parent cleanup notes
</commit_message>
<xml_diff>
--- a/docs/OUTER-PARENT-BASE-RECHECK-20260801.docx
+++ b/docs/OUTER-PARENT-BASE-RECHECK-20260801.docx
@@ -146,6 +146,48 @@
       </w:r>
     </w:p>
     <w:p/>
+    <w:p>
+      <w:pPr>
+        <w:pStyle w:val="Heading1"/>
+      </w:pPr>
+      <w:r>
+        <w:t xml:space="preserve">Cleanup Note</w:t>
+      </w:r>
+    </w:p>
+    <w:p/>
+    <w:p>
+      <w:pPr>
+        <w:numPr>
+          <w:ilvl w:val="0"/>
+          <w:numId w:val="1"/>
+        </w:numPr>
+      </w:pPr>
+      <w:r>
+        <w:t xml:space="preserve">Removed local frontend build output from `dist`; it is generated output and should not be committed.</w:t>
+      </w:r>
+    </w:p>
+    <w:p>
+      <w:pPr>
+        <w:numPr>
+          <w:ilvl w:val="0"/>
+          <w:numId w:val="1"/>
+        </w:numPr>
+      </w:pPr>
+      <w:r>
+        <w:t xml:space="preserve">No dependency `node_modules/**/dist` package internals were removed.</w:t>
+      </w:r>
+    </w:p>
+    <w:p>
+      <w:pPr>
+        <w:numPr>
+          <w:ilvl w:val="0"/>
+          <w:numId w:val="1"/>
+        </w:numPr>
+      </w:pPr>
+      <w:r>
+        <w:t xml:space="preserve">Keep future build artifacts out of Git; regenerate them through `npm run build` when needed.</w:t>
+      </w:r>
+    </w:p>
     <w:sectPr>
       <w:pgSz w:w="12240" w:h="15840"/>
       <w:pgMar w:top="1440" w:right="1440" w:bottom="1440" w:left="1440" w:header="708" w:footer="708" w:gutter="0"/>

</xml_diff>